<commit_message>
feat: update Word CV document based on 104 profile
</commit_message>
<xml_diff>
--- a/Mau_CV_Tieng_Viet_Resume_VN.docx
+++ b/Mau_CV_Tieng_Viet_Resume_VN.docx
@@ -19,7 +19,7 @@
           <w:color w:val="1E3A8A"/>
           <w:sz w:val="44"/>
         </w:rPr>
-        <w:t>NGUYỄN VĂN A (ALEX NGUYEN)</w:t>
+        <w:t>LÂM MỸ KIM (LIN MEI-JIN / 林美金)</w:t>
       </w:r>
     </w:p>
     <w:p>
@@ -37,7 +37,7 @@
           <w:b/>
           <w:color w:val="2563EB"/>
         </w:rPr>
-        <w:t>Mục tiêu: Lập trình viên Front-End / Quản lý Sản phẩm (PM) / Chuyển ngành</w:t>
+        <w:t>Mục tiêu: Thao tác viên sản xuất (作業員) / Đóng gói (包裝員) / Nhân viên cửa hàng (門市人員)</w:t>
       </w:r>
     </w:p>
     <w:p>
@@ -55,15 +55,16 @@
           <w:color w:val="4B5563"/>
           <w:sz w:val="19"/>
         </w:rPr>
-        <w:t>📧</w:t>
-      </w:r>
-      <w:r>
-        <w:rPr>
-          <w:rFonts w:ascii="Calibri" w:hAnsi="Calibri" w:cs="Calibri"/>
-          <w:color w:val="4B5563"/>
-          <w:sz w:val="19"/>
-        </w:rPr>
-        <w:t xml:space="preserve"> alex.nguyen@example.com  |  </w:t>
+        <w:t>📍 Khu Trung Lịch, TP. Đào Viên, Đài Loan (桃園市中壢區 協同街)  |  🛵 Có bằng lái &amp; xe máy riêng (普通重型機車)</w:t>
+      </w:r>
+      <w:r>
+        <w:rPr>
+          <w:rFonts w:ascii="Calibri" w:hAnsi="Calibri" w:cs="Calibri"/>
+          <w:color w:val="4B5563"/>
+          <w:sz w:val="19"/>
+        </w:rPr>
+        <w:t xml:space="preserve">
+        </w:t>
       </w:r>
       <w:r>
         <w:rPr>
@@ -71,15 +72,17 @@
           <w:color w:val="4B5563"/>
           <w:sz w:val="19"/>
         </w:rPr>
-        <w:t>📱</w:t>
-      </w:r>
-      <w:r>
-        <w:rPr>
-          <w:rFonts w:ascii="Calibri" w:hAnsi="Calibri" w:cs="Calibri"/>
-          <w:color w:val="4B5563"/>
-          <w:sz w:val="19"/>
-        </w:rPr>
-        <w:t xml:space="preserve"> 0912 345 678  |  </w:t>
+        <w:t>
+        </w:t>
+      </w:r>
+      <w:r>
+        <w:rPr>
+          <w:rFonts w:ascii="Calibri" w:hAnsi="Calibri" w:cs="Calibri"/>
+          <w:color w:val="4B5563"/>
+          <w:sz w:val="19"/>
+        </w:rPr>
+        <w:t xml:space="preserve">
+        </w:t>
       </w:r>
       <w:r>
         <w:rPr>
@@ -87,15 +90,17 @@
           <w:color w:val="4B5563"/>
           <w:sz w:val="19"/>
         </w:rPr>
-        <w:t>📍</w:t>
-      </w:r>
-      <w:r>
-        <w:rPr>
-          <w:rFonts w:ascii="Calibri" w:hAnsi="Calibri" w:cs="Calibri"/>
-          <w:color w:val="4B5563"/>
-          <w:sz w:val="19"/>
-        </w:rPr>
-        <w:t xml:space="preserve"> TP. Hồ Chí Minh / Hà Nội (Sẵn sàng làm Hybrid / Remote)</w:t>
+        <w:t>
+        </w:t>
+      </w:r>
+      <w:r>
+        <w:rPr>
+          <w:rFonts w:ascii="Calibri" w:hAnsi="Calibri" w:cs="Calibri"/>
+          <w:color w:val="4B5563"/>
+          <w:sz w:val="19"/>
+        </w:rPr>
+        <w:t xml:space="preserve">
+        </w:t>
       </w:r>
     </w:p>
     <w:p>
@@ -113,15 +118,16 @@
           <w:color w:val="4B5563"/>
           <w:sz w:val="19"/>
         </w:rPr>
-        <w:t>🌐</w:t>
-      </w:r>
-      <w:r>
-        <w:rPr>
-          <w:rFonts w:ascii="Calibri" w:hAnsi="Calibri" w:cs="Calibri"/>
-          <w:color w:val="4B5563"/>
-          <w:sz w:val="19"/>
-        </w:rPr>
-        <w:t xml:space="preserve"> Portfolio: myportfolio.dev  |  </w:t>
+        <w:t>📱 SĐT: [Điền SĐT Đài Loan]  |  📧 Email: [Điền Email]  |  💻 GitHub: github.com/MeiChin1406</w:t>
+      </w:r>
+      <w:r>
+        <w:rPr>
+          <w:rFonts w:ascii="Calibri" w:hAnsi="Calibri" w:cs="Calibri"/>
+          <w:color w:val="4B5563"/>
+          <w:sz w:val="19"/>
+        </w:rPr>
+        <w:t xml:space="preserve">
+        </w:t>
       </w:r>
       <w:r>
         <w:rPr>
@@ -129,15 +135,17 @@
           <w:color w:val="4B5563"/>
           <w:sz w:val="19"/>
         </w:rPr>
-        <w:t>💻</w:t>
-      </w:r>
-      <w:r>
-        <w:rPr>
-          <w:rFonts w:ascii="Calibri" w:hAnsi="Calibri" w:cs="Calibri"/>
-          <w:color w:val="4B5563"/>
-          <w:sz w:val="19"/>
-        </w:rPr>
-        <w:t xml:space="preserve"> GitHub: github.com/username  |  </w:t>
+        <w:t>
+        </w:t>
+      </w:r>
+      <w:r>
+        <w:rPr>
+          <w:rFonts w:ascii="Calibri" w:hAnsi="Calibri" w:cs="Calibri"/>
+          <w:color w:val="4B5563"/>
+          <w:sz w:val="19"/>
+        </w:rPr>
+        <w:t xml:space="preserve">
+        </w:t>
       </w:r>
       <w:r>
         <w:rPr>
@@ -145,15 +153,17 @@
           <w:color w:val="4B5563"/>
           <w:sz w:val="19"/>
         </w:rPr>
-        <w:t>🔗</w:t>
-      </w:r>
-      <w:r>
-        <w:rPr>
-          <w:rFonts w:ascii="Calibri" w:hAnsi="Calibri" w:cs="Calibri"/>
-          <w:color w:val="4B5563"/>
-          <w:sz w:val="19"/>
-        </w:rPr>
-        <w:t xml:space="preserve"> LinkedIn: linkedin.com/in/username</w:t>
+        <w:t>
+        </w:t>
+      </w:r>
+      <w:r>
+        <w:rPr>
+          <w:rFonts w:ascii="Calibri" w:hAnsi="Calibri" w:cs="Calibri"/>
+          <w:color w:val="4B5563"/>
+          <w:sz w:val="19"/>
+        </w:rPr>
+        <w:t xml:space="preserve">
+        </w:t>
       </w:r>
     </w:p>
     <w:p>
@@ -176,7 +186,7 @@
           <w:color w:val="1E3A8A"/>
           <w:sz w:val="25"/>
         </w:rPr>
-        <w:t>▍</w:t>
+        <w:t>▍ TÓM TẮT NĂNG LỰC &amp; MỤC TIÊU NGHỀ NGHIỆP (SUMMARY)</w:t>
       </w:r>
       <w:r>
         <w:rPr>
@@ -185,7 +195,8 @@
           <w:color w:val="1E3A8A"/>
           <w:sz w:val="25"/>
         </w:rPr>
-        <w:t xml:space="preserve"> TÓM TẮT NĂNG LỰC &amp; MỤC TIÊU NGHỀ NGHIỆP (SUMMARY)</w:t>
+        <w:t xml:space="preserve">
+        </w:t>
       </w:r>
     </w:p>
     <w:p>
@@ -206,7 +217,7 @@
           <w:color w:val="1F2937"/>
           <w:sz w:val="19"/>
         </w:rPr>
-        <w:t>Tốt nghiệp khối ngành Kinh tế / Quản trị với tư duy logic kinh doanh vững vàng và khả năng giao tiếp đa phòng ban linh hoạt. Nhận thấy niềm đam mê lớn trong việc 'xây dựng các sản phẩm số tương tác cao và giải quyết bài toán người dùng', tôi đã dành hơn 600 giờ tự học chuyên sâu về phát triển Front-End hiện đại (React, JavaScript ES6+, tích hợp RESTful API). Có thế mạnh đặc biệt trong việc kết hợp tư duy trải nghiệm khách hàng với năng lực kỹ thuật, khả năng tự học nhanh và tinh thần trách nhiệm cao, mong muốn đóng góp giá trị bền vững cho đội ngũ phát triển.</w:t>
+        <w:t>Hơn 5 năm kinh nghiệm làm việc thực tế tại Đài Loan, trong đó có hơn 3 năm làm việc trong môi trường nhà máy sản xuất bán dẫn quy mô lớn (&gt;500 người) và hơn 1 năm làm nhân viên bán hàng chuỗi cửa hàng tiện lợi Hi-Life (萊爾富). Nắm vững quy trình phòng sạch (Cleanroom), đồ bảo hộ chống tĩnh điện ESD, thao tác máy móc theo chuẩn SOP, kiểm tra ngoại quan (Visual Inspection) và đóng gói linh kiện. Tiếng Trung giao tiếp tốt trong công việc và đời sống, tác phong nhanh nhẹn, cẩn thận, kỷ luật cao, chịu được áp lực ca kíp và sẵn sàng đi làm ngay.</w:t>
       </w:r>
     </w:p>
     <w:p>
@@ -229,7 +240,7 @@
           <w:color w:val="1E3A8A"/>
           <w:sz w:val="25"/>
         </w:rPr>
-        <w:t>▍</w:t>
+        <w:t>▍ KỸ NĂNG &amp; NĂNG LỰC LÀM VIỆC (CORE COMPETENCIES)</w:t>
       </w:r>
       <w:r>
         <w:rPr>
@@ -238,7 +249,8 @@
           <w:color w:val="1E3A8A"/>
           <w:sz w:val="25"/>
         </w:rPr>
-        <w:t xml:space="preserve"> KỸ NĂNG CHUYÊN MÔN &amp; CÔNG CỤ (CORE COMPETENCIES)</w:t>
+        <w:t xml:space="preserve">
+        </w:t>
       </w:r>
     </w:p>
     <w:tbl>
@@ -284,7 +296,7 @@
                 <w:color w:val="2563EB"/>
                 <w:sz w:val="19"/>
               </w:rPr>
-              <w:t>•</w:t>
+              <w:t>• Kỹ thuật Sản xuất &amp; Nhà máy (製造與產線技能)</w:t>
             </w:r>
             <w:r>
               <w:rPr>
@@ -293,7 +305,8 @@
                 <w:color w:val="2563EB"/>
                 <w:sz w:val="19"/>
               </w:rPr>
-              <w:t xml:space="preserve"> Lập trình &amp; Kỹ thuật</w:t>
+              <w:t xml:space="preserve">
+              </w:t>
             </w:r>
           </w:p>
         </w:tc>
@@ -317,7 +330,7 @@
                 <w:color w:val="1F2937"/>
                 <w:sz w:val="19"/>
               </w:rPr>
-              <w:t>JavaScript (ES6+), React.js, HTML5 / CSS3, Tailwind CSS, RESTful API, Node.js (cơ bản)</w:t>
+              <w:t>Quy trình phòng sạch (Cleanroom), trang phục tĩnh điện ESD, thao tác máy móc dây chuyền (作業員), kiểm tra ngoại quan linh kiện (QC), đóng gói sản phẩm (包裝員), thực hành chuẩn 5S &amp; an toàn lao động.</w:t>
             </w:r>
           </w:p>
         </w:tc>
@@ -351,7 +364,7 @@
                 <w:color w:val="2563EB"/>
                 <w:sz w:val="19"/>
               </w:rPr>
-              <w:t>•</w:t>
+              <w:t>• Nghiệp vụ Cửa hàng &amp; Dịch vụ (門市與服務技能)</w:t>
             </w:r>
             <w:r>
               <w:rPr>
@@ -360,7 +373,8 @@
                 <w:color w:val="2563EB"/>
                 <w:sz w:val="19"/>
               </w:rPr>
-              <w:t xml:space="preserve"> Công cụ &amp; Phiên bản</w:t>
+              <w:t xml:space="preserve">
+              </w:t>
             </w:r>
           </w:p>
         </w:tc>
@@ -384,7 +398,7 @@
                 <w:color w:val="1F2937"/>
                 <w:sz w:val="19"/>
               </w:rPr>
-              <w:t>Git, GitHub, VS Code, Vite, Postman, Figma (đọc thiết kế UI/UX)</w:t>
+              <w:t>Vận hành máy POS thu ngân, thanh toán thẻ EasyCard/tiền mặt, kiểm kê &amp; sắp xếp hàng hóa (FIFO), pha chế cà phê Hi Café/đồ ăn nhanh, giao nhận bưu kiện EC, chăm sóc khách hàng bằng tiếng Trung.</w:t>
             </w:r>
           </w:p>
         </w:tc>
@@ -418,7 +432,7 @@
                 <w:color w:val="2563EB"/>
                 <w:sz w:val="19"/>
               </w:rPr>
-              <w:t>•</w:t>
+              <w:t>• Tác phong &amp; Phẩm chất</w:t>
             </w:r>
             <w:r>
               <w:rPr>
@@ -427,7 +441,8 @@
                 <w:color w:val="2563EB"/>
                 <w:sz w:val="19"/>
               </w:rPr>
-              <w:t xml:space="preserve"> Kỹ năng chuyển giao (Soft skills)</w:t>
+              <w:t xml:space="preserve">
+              </w:t>
             </w:r>
           </w:p>
         </w:tc>
@@ -451,7 +466,7 @@
                 <w:color w:val="1F2937"/>
                 <w:sz w:val="19"/>
               </w:rPr>
-              <w:t>Phân tích yêu cầu kinh doanh, mô hình Agile/Scrum, giao tiếp liên phòng ban, tư duy định lượng số liệu</w:t>
+              <w:t>Thao tác tay nhanh nhẹn, tỉ mỉ, chịu khó, sức khỏe tốt thích nghi cao với ca ngày / ca cuối tuần / tăng ca, giao tiếp tiếng Trung hòa nhã, có xe máy cá nhân chủ động đi lại.</w:t>
             </w:r>
           </w:p>
         </w:tc>
@@ -490,7 +505,7 @@
           <w:color w:val="1E3A8A"/>
           <w:sz w:val="25"/>
         </w:rPr>
-        <w:t>▍</w:t>
+        <w:t>▍ NGUYỆN VỌNG &amp; ĐIỀU KIỆN LÀM VIỆC (JOB CONDITION)</w:t>
       </w:r>
       <w:r>
         <w:rPr>
@@ -499,7 +514,8 @@
           <w:color w:val="1E3A8A"/>
           <w:sz w:val="25"/>
         </w:rPr>
-        <w:t xml:space="preserve"> DỰ ÁN THỰC HÀNH TIÊU BIỂU (FEATURED PROJECTS)</w:t>
+        <w:t xml:space="preserve">
+        </w:t>
       </w:r>
     </w:p>
     <w:p>
@@ -521,7 +537,7 @@
           <w:color w:val="1F2937"/>
           <w:sz w:val="21"/>
         </w:rPr>
-        <w:t>TaskFlow - Nền tảng quản lý công việc theo mô hình Kanban</w:t>
+        <w:t>Vị trí mong muốn: Thao tác viên sản xuất (作業員) / Đóng gói (包裝員) / Phục vụ nhà hàng (餐飲服務生) / Nhân viên cây xăng (加油員)</w:t>
       </w:r>
       <w:r>
         <w:rPr>
@@ -529,7 +545,8 @@
           <w:color w:val="4B5563"/>
           <w:sz w:val="18"/>
         </w:rPr>
-        <w:t xml:space="preserve">  |  Dự án độc lập cá nhân  |  01/2026 - 03/2026</w:t>
+        <w:t xml:space="preserve">
+        </w:t>
       </w:r>
     </w:p>
     <w:p>
@@ -551,7 +568,7 @@
           <w:color w:val="2563EB"/>
           <w:sz w:val="18"/>
         </w:rPr>
-        <w:t>Công nghệ: React, Context API, Tailwind CSS, Vite, RESTful API, Vercel</w:t>
+        <w:t>• Thời gian làm việc: Toàn thời gian (全職)  |  Ca làm việc: Ca ngày (日班), Ca cuối tuần (假日班), sẵn sàng luân ca và tăng ca.</w:t>
       </w:r>
     </w:p>
     <w:p>
@@ -572,15 +589,16 @@
           <w:color w:val="1F2937"/>
           <w:sz w:val="19"/>
         </w:rPr>
-        <w:t>•</w:t>
-      </w:r>
-      <w:r>
-        <w:rPr>
-          <w:rFonts w:ascii="Calibri" w:hAnsi="Calibri" w:cs="Calibri"/>
-          <w:color w:val="1F2937"/>
-          <w:sz w:val="19"/>
-        </w:rPr>
-        <w:t xml:space="preserve"> Thiết kế kiến trúc: Sử dụng React kết hợp Context API xây dựng bảng Kanban tương tác trực quan, hỗ trợ kéo thả thẻ tác vụ (Drag &amp; Drop) và cập nhật trạng thái tức thì, đạt điểm hiệu năng 95+ trên Google Lighthouse.</w:t>
+        <w:t>• Khu vực ưu tiên: Khu Trung Lịch, TP. Đào Viên (桃園市中壢區) và các khu vực lân cận.</w:t>
+      </w:r>
+      <w:r>
+        <w:rPr>
+          <w:rFonts w:ascii="Calibri" w:hAnsi="Calibri" w:cs="Calibri"/>
+          <w:color w:val="1F2937"/>
+          <w:sz w:val="19"/>
+        </w:rPr>
+        <w:t xml:space="preserve">
+        </w:t>
       </w:r>
     </w:p>
     <w:p>
@@ -601,15 +619,16 @@
           <w:color w:val="1F2937"/>
           <w:sz w:val="19"/>
         </w:rPr>
-        <w:t>•</w:t>
-      </w:r>
-      <w:r>
-        <w:rPr>
-          <w:rFonts w:ascii="Calibri" w:hAnsi="Calibri" w:cs="Calibri"/>
-          <w:color w:val="1F2937"/>
-          <w:sz w:val="19"/>
-        </w:rPr>
-        <w:t xml:space="preserve"> Tích hợp API: Thiết kế đặc tả RESTful API rõ ràng, xử lý lọc phân loại nhãn và cơ chế lưu tạm dữ liệu, giảm 40% số lượng truy vấn bất đồng bộ dư thừa.</w:t>
+        <w:t>• Mức lương: Theo thỏa thuận &amp; quy định của công ty (依公司規定 / 月薪).</w:t>
+      </w:r>
+      <w:r>
+        <w:rPr>
+          <w:rFonts w:ascii="Calibri" w:hAnsi="Calibri" w:cs="Calibri"/>
+          <w:color w:val="1F2937"/>
+          <w:sz w:val="19"/>
+        </w:rPr>
+        <w:t xml:space="preserve">
+        </w:t>
       </w:r>
     </w:p>
     <w:p>
@@ -630,15 +649,16 @@
           <w:color w:val="1F2937"/>
           <w:sz w:val="19"/>
         </w:rPr>
-        <w:t>•</w:t>
-      </w:r>
-      <w:r>
-        <w:rPr>
-          <w:rFonts w:ascii="Calibri" w:hAnsi="Calibri" w:cs="Calibri"/>
-          <w:color w:val="1F2937"/>
-          <w:sz w:val="19"/>
-        </w:rPr>
-        <w:t xml:space="preserve"> Trải nghiệm người dùng: Thu thập phản hồi từ 120+ người dùng thử nghiệm để tối ưu giao diện co giãn responsive trên điện thoại và phím tắt điều hướng nhanh.</w:t>
+        <w:t>• Thời gian nhận việc: Có thể đi làm ngay sau khi trúng tuyển (錄取後隨時可上班).</w:t>
+      </w:r>
+      <w:r>
+        <w:rPr>
+          <w:rFonts w:ascii="Calibri" w:hAnsi="Calibri" w:cs="Calibri"/>
+          <w:color w:val="1F2937"/>
+          <w:sz w:val="19"/>
+        </w:rPr>
+        <w:t xml:space="preserve">
+        </w:t>
       </w:r>
     </w:p>
     <w:p>
@@ -660,7 +680,7 @@
           <w:color w:val="1F2937"/>
           <w:sz w:val="21"/>
         </w:rPr>
-        <w:t>PriceRadar - Dashboard theo dõi và trực quan hóa biến động giá thương mại điện tử</w:t>
+        <w:t>▍ KINH NGHIỆM LÀM VIỆC THỰC TẾ (WORK EXPERIENCE)</w:t>
       </w:r>
       <w:r>
         <w:rPr>
@@ -668,7 +688,8 @@
           <w:color w:val="4B5563"/>
           <w:sz w:val="18"/>
         </w:rPr>
-        <w:t xml:space="preserve">  |  Dự án Phân tích &amp; Trực quan dữ liệu  |  09/2025 - 11/2025</w:t>
+        <w:t xml:space="preserve">
+        </w:t>
       </w:r>
     </w:p>
     <w:p>
@@ -690,7 +711,7 @@
           <w:color w:val="2563EB"/>
           <w:sz w:val="18"/>
         </w:rPr>
-        <w:t>Công nghệ: JavaScript (ES6+), Chart.js, Fetch API, HTML5/CSS3</w:t>
+        <w:t>Công ty Sản xuất Bán dẫn (半導體製造業)  |  Thao tác viên sản xuất &amp; đóng gói (作業員 / 包裝員)  |  03/2021 - Hiện tại</w:t>
       </w:r>
     </w:p>
     <w:p>
@@ -711,15 +732,16 @@
           <w:color w:val="1F2937"/>
           <w:sz w:val="19"/>
         </w:rPr>
-        <w:t>•</w:t>
-      </w:r>
-      <w:r>
-        <w:rPr>
-          <w:rFonts w:ascii="Calibri" w:hAnsi="Calibri" w:cs="Calibri"/>
-          <w:color w:val="1F2937"/>
-          <w:sz w:val="19"/>
-        </w:rPr>
-        <w:t xml:space="preserve"> Trực quan hóa dữ liệu: Tích hợp Chart.js để vẽ biểu đồ đường theo dõi lịch sử giá và tỉ lệ giảm giá theo thời gian thực, giúp người dùng dễ dàng ra quyết định mua hàng.</w:t>
+        <w:t>• Môi trường phòng sạch: Làm việc trong phòng sạch (Cleanroom), mặc trang phục bảo hộ chống tĩnh điện ESD, tuân thủ nghiêm ngặt quy định an toàn vệ sinh lao động và tiêu chuẩn 5S.</w:t>
+      </w:r>
+      <w:r>
+        <w:rPr>
+          <w:rFonts w:ascii="Calibri" w:hAnsi="Calibri" w:cs="Calibri"/>
+          <w:color w:val="1F2937"/>
+          <w:sz w:val="19"/>
+        </w:rPr>
+        <w:t xml:space="preserve">
+        </w:t>
       </w:r>
     </w:p>
     <w:p>
@@ -740,15 +762,16 @@
           <w:color w:val="1F2937"/>
           <w:sz w:val="19"/>
         </w:rPr>
-        <w:t>•</w:t>
-      </w:r>
-      <w:r>
-        <w:rPr>
-          <w:rFonts w:ascii="Calibri" w:hAnsi="Calibri" w:cs="Calibri"/>
-          <w:color w:val="1F2937"/>
-          <w:sz w:val="19"/>
-        </w:rPr>
-        <w:t xml:space="preserve"> Kết hợp tư duy kinh doanh: Ứng dụng mô hình tâm lý tiêu dùng để xây dựng thuật toán gợi ý 'Thời điểm mua tối ưu', giúp tăng thời lượng người dùng ở lại trang web thêm 35%.</w:t>
+        <w:t>• Vận hành máy &amp; kiểm tra chất lượng: Thao tác máy móc theo bảng hướng dẫn (SOP), kiểm tra ngoại quan (Visual Inspection) phát hiện linh kiện lỗi, đạt chỉ tiêu sản lượng (UPH) hàng ngày.</w:t>
+      </w:r>
+      <w:r>
+        <w:rPr>
+          <w:rFonts w:ascii="Calibri" w:hAnsi="Calibri" w:cs="Calibri"/>
+          <w:color w:val="1F2937"/>
+          <w:sz w:val="19"/>
+        </w:rPr>
+        <w:t xml:space="preserve">
+        </w:t>
       </w:r>
     </w:p>
     <w:p>
@@ -771,7 +794,7 @@
           <w:color w:val="1E3A8A"/>
           <w:sz w:val="25"/>
         </w:rPr>
-        <w:t>▍</w:t>
+        <w:t>• Đóng gói thành phẩm: Dán tem mã vạch (Barcode), đóng gói sản phẩm hoàn thiện vào khay/hộp chuyên dụng đảm bảo an toàn tuyệt đối khi vận chuyển.</w:t>
       </w:r>
       <w:r>
         <w:rPr>
@@ -780,7 +803,8 @@
           <w:color w:val="1E3A8A"/>
           <w:sz w:val="25"/>
         </w:rPr>
-        <w:t xml:space="preserve"> KINH NGHIỆM THỰC TẬP &amp; HOẠT ĐỘNG (WORK EXPERIENCE)</w:t>
+        <w:t xml:space="preserve">
+        </w:t>
       </w:r>
     </w:p>
     <w:p>
@@ -802,7 +826,7 @@
           <w:color w:val="1F2937"/>
           <w:sz w:val="21"/>
         </w:rPr>
-        <w:t>Vườn ươm Khởi nghiệp &amp; Đầu tư mạo hiểm  |  Thực tập sinh Quản lý Dự án &amp; Marketing số</w:t>
+        <w:t>Công ty CP Quốc tế Hi-Life (萊爾富國際股份有限公司)  |  Nhân viên bán hàng &amp; Thu ngân (門市店員)  |  10/2019 - 02/2021</w:t>
       </w:r>
       <w:r>
         <w:rPr>
@@ -810,7 +834,8 @@
           <w:color w:val="4B5563"/>
           <w:sz w:val="18"/>
         </w:rPr>
-        <w:t xml:space="preserve">  |  02/2025 - 08/2025</w:t>
+        <w:t xml:space="preserve">
+        </w:t>
       </w:r>
     </w:p>
     <w:p>
@@ -831,15 +856,16 @@
           <w:color w:val="1F2937"/>
           <w:sz w:val="19"/>
         </w:rPr>
-        <w:t>•</w:t>
-      </w:r>
-      <w:r>
-        <w:rPr>
-          <w:rFonts w:ascii="Calibri" w:hAnsi="Calibri" w:cs="Calibri"/>
-          <w:color w:val="1F2937"/>
-          <w:sz w:val="19"/>
-        </w:rPr>
-        <w:t xml:space="preserve"> Cầu nối kỹ thuật &amp; vận hành: Hỗ trợ viết tài liệu yêu cầu sản phẩm (PRD) và thực hiện kịch bản kiểm thử (UAT) giữa đội Marketing và đội Kỹ thuật, rút ngắn thời gian bàn giao Landing Page 20%.</w:t>
+        <w:t>• Thu ngân &amp; Dịch vụ: Vận hành máy POS xử lý thanh toán tiền mặt, thẻ EasyCard, hóa đơn tiện ích; giao tiếp tiếng Trung niềm nở, chu đáo hỗ trợ khách hàng mua sắm.</w:t>
+      </w:r>
+      <w:r>
+        <w:rPr>
+          <w:rFonts w:ascii="Calibri" w:hAnsi="Calibri" w:cs="Calibri"/>
+          <w:color w:val="1F2937"/>
+          <w:sz w:val="19"/>
+        </w:rPr>
+        <w:t xml:space="preserve">
+        </w:t>
       </w:r>
     </w:p>
     <w:p>
@@ -860,15 +886,16 @@
           <w:color w:val="1F2937"/>
           <w:sz w:val="19"/>
         </w:rPr>
-        <w:t>•</w:t>
-      </w:r>
-      <w:r>
-        <w:rPr>
-          <w:rFonts w:ascii="Calibri" w:hAnsi="Calibri" w:cs="Calibri"/>
-          <w:color w:val="1F2937"/>
-          <w:sz w:val="19"/>
-        </w:rPr>
-        <w:t xml:space="preserve"> Tối ưu dựa trên dữ liệu: Phân tích phễu chuyển đổi qua Google Analytics 4, đề xuất cải tiến mẫu đăng ký giúp tăng tỷ lệ chuyển đổi hoàn tất thêm 18%.</w:t>
+        <w:t>• Quản lý hàng hóa: Nhận hàng từ xe giao vận, kiểm đếm số lượng, sắp xếp bổ sung hàng lên kệ theo nguyên tắc nhập trước xuất trước (FIFO), kiểm tra hạn sử dụng và vệ sinh cửa hàng.</w:t>
+      </w:r>
+      <w:r>
+        <w:rPr>
+          <w:rFonts w:ascii="Calibri" w:hAnsi="Calibri" w:cs="Calibri"/>
+          <w:color w:val="1F2937"/>
+          <w:sz w:val="19"/>
+        </w:rPr>
+        <w:t xml:space="preserve">
+        </w:t>
       </w:r>
     </w:p>
     <w:p>
@@ -889,15 +916,16 @@
           <w:color w:val="1F2937"/>
           <w:sz w:val="19"/>
         </w:rPr>
-        <w:t>•</w:t>
-      </w:r>
-      <w:r>
-        <w:rPr>
-          <w:rFonts w:ascii="Calibri" w:hAnsi="Calibri" w:cs="Calibri"/>
-          <w:color w:val="1F2937"/>
-          <w:sz w:val="19"/>
-        </w:rPr>
-        <w:t xml:space="preserve"> Tự động hóa quy trình: Viết tập lệnh Google Apps Script tự động tổng hợp danh sách khách hàng hàng ngày, tiết kiệm 4 giờ thao tác thủ công mỗi tuần cho cả nhóm.</w:t>
+        <w:t>• Chế biến thực phẩm &amp; Bưu kiện: Pha chế cà phê Hi Café, nướng khoai, chế biến thức ăn nhanh an toàn vệ sinh; quản lý tiếp nhận và trả bưu kiện mua sắm online (EC) chính xác.</w:t>
+      </w:r>
+      <w:r>
+        <w:rPr>
+          <w:rFonts w:ascii="Calibri" w:hAnsi="Calibri" w:cs="Calibri"/>
+          <w:color w:val="1F2937"/>
+          <w:sz w:val="19"/>
+        </w:rPr>
+        <w:t xml:space="preserve">
+        </w:t>
       </w:r>
     </w:p>
     <w:p>
@@ -920,7 +948,7 @@
           <w:color w:val="1E3A8A"/>
           <w:sz w:val="25"/>
         </w:rPr>
-        <w:t>▍</w:t>
+        <w:t>▍ HỌC VẤN &amp; NGOẠI NGỮ (EDUCATION &amp; LANGUAGES)</w:t>
       </w:r>
       <w:r>
         <w:rPr>
@@ -929,7 +957,8 @@
           <w:color w:val="1E3A8A"/>
           <w:sz w:val="25"/>
         </w:rPr>
-        <w:t xml:space="preserve"> HỌC VẤN &amp; CHỨNG CHỈ (EDUCATION &amp; CERTIFICATIONS)</w:t>
+        <w:t xml:space="preserve">
+        </w:t>
       </w:r>
     </w:p>
     <w:p>
@@ -951,7 +980,7 @@
           <w:color w:val="1F2937"/>
           <w:sz w:val="20"/>
         </w:rPr>
-        <w:t>Trường Đại học Quốc gia  |  Cử nhân Quản trị Kinh doanh</w:t>
+        <w:t>Trường Trung học Phổ thông tại Việt Nam (越南)  |  Tốt nghiệp THPT - Ban Tự nhiên (自然組)  |  2006 - 2018</w:t>
       </w:r>
       <w:r>
         <w:rPr>
@@ -959,7 +988,8 @@
           <w:color w:val="4B5563"/>
           <w:sz w:val="18"/>
         </w:rPr>
-        <w:t xml:space="preserve"> (2022 - 2026)</w:t>
+        <w:t xml:space="preserve">
+        </w:t>
       </w:r>
     </w:p>
     <w:p>
@@ -980,15 +1010,16 @@
           <w:color w:val="1F2937"/>
           <w:sz w:val="19"/>
         </w:rPr>
-        <w:t>•</w:t>
-      </w:r>
-      <w:r>
-        <w:rPr>
-          <w:rFonts w:ascii="Calibri" w:hAnsi="Calibri" w:cs="Calibri"/>
-          <w:color w:val="1F2937"/>
-          <w:sz w:val="19"/>
-        </w:rPr>
-        <w:t xml:space="preserve"> Điểm trung bình (GPA): 3.8 / 4.0  |  Các môn học bổ trợ: Nhập môn Khoa học Máy tính, Thiết kế Web, Cơ sở dữ liệu</w:t>
+        <w:t>• Học vấn: Tốt nghiệp Trung học phổ thông (高中普通科). Nền tảng khối Tự nhiên, rèn luyện tư duy cẩn thận, kiên trì và chịu khó.</w:t>
+      </w:r>
+      <w:r>
+        <w:rPr>
+          <w:rFonts w:ascii="Calibri" w:hAnsi="Calibri" w:cs="Calibri"/>
+          <w:color w:val="1F2937"/>
+          <w:sz w:val="19"/>
+        </w:rPr>
+        <w:t xml:space="preserve">
+        </w:t>
       </w:r>
     </w:p>
     <w:p>
@@ -1009,15 +1040,16 @@
           <w:color w:val="1F2937"/>
           <w:sz w:val="19"/>
         </w:rPr>
-        <w:t>•</w:t>
-      </w:r>
-      <w:r>
-        <w:rPr>
-          <w:rFonts w:ascii="Calibri" w:hAnsi="Calibri" w:cs="Calibri"/>
-          <w:color w:val="1F2937"/>
-          <w:sz w:val="19"/>
-        </w:rPr>
-        <w:t xml:space="preserve"> Chứng chỉ chuyên môn: Meta Front-End Developer Professional Certificate (Coursera, 2026)</w:t>
+        <w:t>• Tiếng Việt (越文): Tiếng mẹ đẻ, tinh thông thành thạo 4 kỹ năng (Nghe, Nói, Đọc, Viết).</w:t>
+      </w:r>
+      <w:r>
+        <w:rPr>
+          <w:rFonts w:ascii="Calibri" w:hAnsi="Calibri" w:cs="Calibri"/>
+          <w:color w:val="1F2937"/>
+          <w:sz w:val="19"/>
+        </w:rPr>
+        <w:t xml:space="preserve">
+        </w:t>
       </w:r>
     </w:p>
     <w:p>
@@ -1038,15 +1070,16 @@
           <w:color w:val="1F2937"/>
           <w:sz w:val="19"/>
         </w:rPr>
-        <w:t>•</w:t>
-      </w:r>
-      <w:r>
-        <w:rPr>
-          <w:rFonts w:ascii="Calibri" w:hAnsi="Calibri" w:cs="Calibri"/>
-          <w:color w:val="1F2937"/>
-          <w:sz w:val="19"/>
-        </w:rPr>
-        <w:t xml:space="preserve"> Ngoại ngữ: TOEIC 895 điểm (Chứng chỉ Vàng, Nghe 465 / Đọc 430) </w:t>
+        <w:t>• Tiếng Trung (中文): Giao tiếp tốt trong công việc và cuộc sống hàng ngày tại Đài Loan hơn 5 năm qua.</w:t>
+      </w:r>
+      <w:r>
+        <w:rPr>
+          <w:rFonts w:ascii="Calibri" w:hAnsi="Calibri" w:cs="Calibri"/>
+          <w:color w:val="1F2937"/>
+          <w:sz w:val="19"/>
+        </w:rPr>
+        <w:t xml:space="preserve">
+        </w:t>
       </w:r>
       <w:r>
         <w:rPr>
@@ -1054,15 +1087,17 @@
           <w:color w:val="1F2937"/>
           <w:sz w:val="19"/>
         </w:rPr>
-        <w:t>｜</w:t>
-      </w:r>
-      <w:r>
-        <w:rPr>
-          <w:rFonts w:ascii="Calibri" w:hAnsi="Calibri" w:cs="Calibri"/>
-          <w:color w:val="1F2937"/>
-          <w:sz w:val="19"/>
-        </w:rPr>
-        <w:t xml:space="preserve"> Tiếng Việt (Bản ngữ)</w:t>
+        <w:t>
+        </w:t>
+      </w:r>
+      <w:r>
+        <w:rPr>
+          <w:rFonts w:ascii="Calibri" w:hAnsi="Calibri" w:cs="Calibri"/>
+          <w:color w:val="1F2937"/>
+          <w:sz w:val="19"/>
+        </w:rPr>
+        <w:t xml:space="preserve">
+        </w:t>
       </w:r>
     </w:p>
     <w:p>

</xml_diff>